<commit_message>
cập nhật báo cáo
</commit_message>
<xml_diff>
--- a/Tuan03/bao_cao_house_prices.docx
+++ b/Tuan03/bao_cao_house_prices.docx
@@ -4,12 +4,12 @@
   <w:body>
     <w:p>
       <w:pPr>
-        <w:spacing w:after="0" w:line="360" w:lineRule="auto"/>
+        <w:spacing w:after="0" w:line="312" w:lineRule="auto"/>
         <w:ind w:left="-90"/>
         <w:jc w:val="center"/>
         <w:rPr>
           <w:rFonts w:cs="Times New Roman"/>
-          <w:color w:val="000000" w:themeColor="text1"/>
+          <w:sz w:val="26"/>
           <w:szCs w:val="26"/>
         </w:rPr>
       </w:pPr>
@@ -17,7 +17,7 @@
         <w:rPr>
           <w:rFonts w:cs="Times New Roman"/>
           <w:b/>
-          <w:color w:val="000000" w:themeColor="text1"/>
+          <w:sz w:val="26"/>
           <w:szCs w:val="26"/>
         </w:rPr>
         <w:t>TRƯỜNG ĐẠI HỌC SÀI GÒN</w:t>
@@ -30,7 +30,6 @@
         <w:rPr>
           <w:rFonts w:cs="Times New Roman"/>
           <w:b/>
-          <w:color w:val="000000" w:themeColor="text1"/>
           <w:sz w:val="26"/>
           <w:szCs w:val="26"/>
         </w:rPr>
@@ -39,7 +38,7 @@
         <w:rPr>
           <w:rFonts w:eastAsia="Calibri" w:cs="Times New Roman"/>
           <w:noProof/>
-          <w:color w:val="000000" w:themeColor="text1"/>
+          <w:sz w:val="26"/>
           <w:szCs w:val="26"/>
         </w:rPr>
         <mc:AlternateContent>
@@ -112,7 +111,7 @@
           </mc:Choice>
           <mc:Fallback>
             <w:pict>
-              <v:group w14:anchorId="05935DAF" id="Group 7393" o:spid="_x0000_s1026" style="width:175.2pt;height:210.95pt;mso-position-horizontal-relative:char;mso-position-vertical-relative:line" coordsize="22009,29159" o:gfxdata="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">
+              <v:group w14:anchorId="4B9F5321" id="Group 7393" o:spid="_x0000_s1026" style="width:175.2pt;height:210.95pt;mso-position-horizontal-relative:char;mso-position-vertical-relative:line" coordsize="22009,29159" o:gfxdata="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">
                 <v:shapetype id="_x0000_t75" coordsize="21600,21600" o:spt="75" o:preferrelative="t" path="m@4@5l@4@11@9@11@9@5xe" filled="f" stroked="f">
                   <v:stroke joinstyle="miter"/>
                   <v:formulas>
@@ -148,7 +147,6 @@
         <w:rPr>
           <w:rFonts w:cs="Times New Roman"/>
           <w:b/>
-          <w:color w:val="000000" w:themeColor="text1"/>
           <w:sz w:val="26"/>
           <w:szCs w:val="26"/>
         </w:rPr>
@@ -158,7 +156,6 @@
         <w:rPr>
           <w:rFonts w:cs="Times New Roman"/>
           <w:b/>
-          <w:color w:val="000000" w:themeColor="text1"/>
           <w:sz w:val="26"/>
           <w:szCs w:val="26"/>
         </w:rPr>
@@ -169,7 +166,6 @@
         <w:rPr>
           <w:rFonts w:cs="Times New Roman"/>
           <w:b/>
-          <w:color w:val="000000" w:themeColor="text1"/>
           <w:sz w:val="26"/>
           <w:szCs w:val="26"/>
         </w:rPr>
@@ -179,7 +175,6 @@
         <w:rPr>
           <w:rFonts w:cs="Times New Roman"/>
           <w:b/>
-          <w:color w:val="000000" w:themeColor="text1"/>
           <w:sz w:val="26"/>
           <w:szCs w:val="26"/>
         </w:rPr>
@@ -193,7 +188,6 @@
         <w:jc w:val="center"/>
         <w:rPr>
           <w:rFonts w:cs="Times New Roman"/>
-          <w:color w:val="000000" w:themeColor="text1"/>
           <w:sz w:val="26"/>
           <w:szCs w:val="26"/>
         </w:rPr>
@@ -202,7 +196,6 @@
         <w:rPr>
           <w:rFonts w:cs="Times New Roman"/>
           <w:b/>
-          <w:color w:val="000000" w:themeColor="text1"/>
           <w:sz w:val="26"/>
           <w:szCs w:val="26"/>
         </w:rPr>
@@ -211,7 +204,6 @@
       <w:r>
         <w:rPr>
           <w:rFonts w:cs="Times New Roman"/>
-          <w:color w:val="000000" w:themeColor="text1"/>
           <w:sz w:val="26"/>
           <w:szCs w:val="26"/>
         </w:rPr>
@@ -224,7 +216,6 @@
         <w:jc w:val="center"/>
         <w:rPr>
           <w:rFonts w:cs="Times New Roman"/>
-          <w:color w:val="000000" w:themeColor="text1"/>
           <w:sz w:val="26"/>
           <w:szCs w:val="26"/>
         </w:rPr>
@@ -235,7 +226,6 @@
         <w:spacing w:line="312" w:lineRule="auto"/>
         <w:rPr>
           <w:rFonts w:cs="Times New Roman"/>
-          <w:color w:val="000000" w:themeColor="text1"/>
           <w:sz w:val="26"/>
           <w:szCs w:val="26"/>
         </w:rPr>
@@ -264,7 +254,6 @@
               <w:jc w:val="center"/>
               <w:rPr>
                 <w:rFonts w:cs="Times New Roman"/>
-                <w:color w:val="000000" w:themeColor="text1"/>
                 <w:sz w:val="26"/>
                 <w:szCs w:val="26"/>
               </w:rPr>
@@ -273,7 +262,6 @@
               <w:rPr>
                 <w:rFonts w:cs="Times New Roman"/>
                 <w:b/>
-                <w:color w:val="000000" w:themeColor="text1"/>
                 <w:sz w:val="26"/>
                 <w:szCs w:val="26"/>
               </w:rPr>
@@ -292,7 +280,6 @@
               <w:jc w:val="center"/>
               <w:rPr>
                 <w:rFonts w:cs="Times New Roman"/>
-                <w:color w:val="000000" w:themeColor="text1"/>
                 <w:sz w:val="26"/>
                 <w:szCs w:val="26"/>
               </w:rPr>
@@ -301,31 +288,10 @@
               <w:rPr>
                 <w:rFonts w:cs="Times New Roman"/>
                 <w:b/>
-                <w:color w:val="000000" w:themeColor="text1"/>
                 <w:sz w:val="26"/>
                 <w:szCs w:val="26"/>
               </w:rPr>
-              <w:t>Mã</w:t>
-            </w:r>
-            <w:r>
-              <w:rPr>
-                <w:rFonts w:cs="Times New Roman"/>
-                <w:b/>
-                <w:color w:val="000000" w:themeColor="text1"/>
-                <w:sz w:val="26"/>
-                <w:szCs w:val="26"/>
-              </w:rPr>
-              <w:t xml:space="preserve"> số</w:t>
-            </w:r>
-            <w:r>
-              <w:rPr>
-                <w:rFonts w:cs="Times New Roman"/>
-                <w:b/>
-                <w:color w:val="000000" w:themeColor="text1"/>
-                <w:sz w:val="26"/>
-                <w:szCs w:val="26"/>
-              </w:rPr>
-              <w:t xml:space="preserve"> sinh viên</w:t>
+              <w:t>Mã số sinh viên</w:t>
             </w:r>
           </w:p>
         </w:tc>
@@ -340,7 +306,6 @@
               <w:jc w:val="center"/>
               <w:rPr>
                 <w:rFonts w:cs="Times New Roman"/>
-                <w:color w:val="000000" w:themeColor="text1"/>
                 <w:sz w:val="26"/>
                 <w:szCs w:val="26"/>
               </w:rPr>
@@ -349,7 +314,6 @@
               <w:rPr>
                 <w:rFonts w:cs="Times New Roman"/>
                 <w:b/>
-                <w:color w:val="000000" w:themeColor="text1"/>
                 <w:sz w:val="26"/>
                 <w:szCs w:val="26"/>
               </w:rPr>
@@ -370,7 +334,6 @@
               <w:jc w:val="center"/>
               <w:rPr>
                 <w:rFonts w:cs="Times New Roman"/>
-                <w:color w:val="000000" w:themeColor="text1"/>
                 <w:sz w:val="26"/>
                 <w:szCs w:val="26"/>
               </w:rPr>
@@ -378,7 +341,6 @@
             <w:r>
               <w:rPr>
                 <w:rFonts w:cs="Times New Roman"/>
-                <w:color w:val="000000" w:themeColor="text1"/>
                 <w:sz w:val="26"/>
                 <w:szCs w:val="26"/>
               </w:rPr>
@@ -397,7 +359,6 @@
               <w:jc w:val="center"/>
               <w:rPr>
                 <w:rFonts w:cs="Times New Roman"/>
-                <w:color w:val="000000" w:themeColor="text1"/>
                 <w:sz w:val="26"/>
                 <w:szCs w:val="26"/>
               </w:rPr>
@@ -405,7 +366,6 @@
             <w:r>
               <w:rPr>
                 <w:rFonts w:cs="Times New Roman"/>
-                <w:color w:val="000000" w:themeColor="text1"/>
                 <w:sz w:val="26"/>
                 <w:szCs w:val="26"/>
               </w:rPr>
@@ -423,7 +383,6 @@
               <w:spacing w:line="312" w:lineRule="auto"/>
               <w:rPr>
                 <w:rFonts w:cs="Times New Roman"/>
-                <w:color w:val="000000" w:themeColor="text1"/>
                 <w:sz w:val="26"/>
                 <w:szCs w:val="26"/>
               </w:rPr>
@@ -431,7 +390,6 @@
             <w:r>
               <w:rPr>
                 <w:rFonts w:cs="Times New Roman"/>
-                <w:color w:val="000000" w:themeColor="text1"/>
                 <w:sz w:val="26"/>
                 <w:szCs w:val="26"/>
               </w:rPr>
@@ -452,7 +410,6 @@
               <w:jc w:val="center"/>
               <w:rPr>
                 <w:rFonts w:cs="Times New Roman"/>
-                <w:color w:val="000000" w:themeColor="text1"/>
                 <w:sz w:val="26"/>
                 <w:szCs w:val="26"/>
               </w:rPr>
@@ -460,7 +417,6 @@
             <w:r>
               <w:rPr>
                 <w:rFonts w:cs="Times New Roman"/>
-                <w:color w:val="000000" w:themeColor="text1"/>
                 <w:sz w:val="26"/>
                 <w:szCs w:val="26"/>
               </w:rPr>
@@ -479,7 +435,6 @@
               <w:jc w:val="center"/>
               <w:rPr>
                 <w:rFonts w:cs="Times New Roman"/>
-                <w:color w:val="000000" w:themeColor="text1"/>
                 <w:sz w:val="26"/>
                 <w:szCs w:val="26"/>
               </w:rPr>
@@ -487,7 +442,6 @@
             <w:r>
               <w:rPr>
                 <w:rFonts w:cs="Times New Roman"/>
-                <w:color w:val="000000" w:themeColor="text1"/>
                 <w:sz w:val="26"/>
                 <w:szCs w:val="26"/>
               </w:rPr>
@@ -505,7 +459,6 @@
               <w:spacing w:line="312" w:lineRule="auto"/>
               <w:rPr>
                 <w:rFonts w:cs="Times New Roman"/>
-                <w:color w:val="000000" w:themeColor="text1"/>
                 <w:sz w:val="26"/>
                 <w:szCs w:val="26"/>
               </w:rPr>
@@ -513,7 +466,6 @@
             <w:r>
               <w:rPr>
                 <w:rFonts w:cs="Times New Roman"/>
-                <w:color w:val="000000" w:themeColor="text1"/>
                 <w:sz w:val="26"/>
                 <w:szCs w:val="26"/>
               </w:rPr>
@@ -534,7 +486,6 @@
               <w:jc w:val="center"/>
               <w:rPr>
                 <w:rFonts w:cs="Times New Roman"/>
-                <w:color w:val="000000" w:themeColor="text1"/>
                 <w:sz w:val="26"/>
                 <w:szCs w:val="26"/>
               </w:rPr>
@@ -542,7 +493,6 @@
             <w:r>
               <w:rPr>
                 <w:rFonts w:cs="Times New Roman"/>
-                <w:color w:val="000000" w:themeColor="text1"/>
                 <w:sz w:val="26"/>
                 <w:szCs w:val="26"/>
               </w:rPr>
@@ -561,7 +511,6 @@
               <w:jc w:val="center"/>
               <w:rPr>
                 <w:rFonts w:cs="Times New Roman"/>
-                <w:color w:val="000000" w:themeColor="text1"/>
                 <w:sz w:val="26"/>
                 <w:szCs w:val="26"/>
               </w:rPr>
@@ -569,7 +518,6 @@
             <w:r>
               <w:rPr>
                 <w:rFonts w:cs="Times New Roman"/>
-                <w:color w:val="000000" w:themeColor="text1"/>
                 <w:sz w:val="26"/>
                 <w:szCs w:val="26"/>
               </w:rPr>
@@ -587,7 +535,6 @@
               <w:spacing w:line="312" w:lineRule="auto"/>
               <w:rPr>
                 <w:rFonts w:cs="Times New Roman"/>
-                <w:color w:val="000000" w:themeColor="text1"/>
                 <w:sz w:val="26"/>
                 <w:szCs w:val="26"/>
               </w:rPr>
@@ -595,7 +542,6 @@
             <w:r>
               <w:rPr>
                 <w:rFonts w:cs="Times New Roman"/>
-                <w:color w:val="000000" w:themeColor="text1"/>
                 <w:sz w:val="26"/>
                 <w:szCs w:val="26"/>
               </w:rPr>
@@ -616,7 +562,6 @@
               <w:jc w:val="center"/>
               <w:rPr>
                 <w:rFonts w:cs="Times New Roman"/>
-                <w:color w:val="000000" w:themeColor="text1"/>
                 <w:sz w:val="26"/>
                 <w:szCs w:val="26"/>
               </w:rPr>
@@ -624,7 +569,6 @@
             <w:r>
               <w:rPr>
                 <w:rFonts w:cs="Times New Roman"/>
-                <w:color w:val="000000" w:themeColor="text1"/>
                 <w:sz w:val="26"/>
                 <w:szCs w:val="26"/>
               </w:rPr>
@@ -643,7 +587,6 @@
               <w:jc w:val="center"/>
               <w:rPr>
                 <w:rFonts w:cs="Times New Roman"/>
-                <w:color w:val="000000" w:themeColor="text1"/>
                 <w:sz w:val="26"/>
                 <w:szCs w:val="26"/>
               </w:rPr>
@@ -651,7 +594,6 @@
             <w:r>
               <w:rPr>
                 <w:rFonts w:cs="Times New Roman"/>
-                <w:color w:val="000000" w:themeColor="text1"/>
                 <w:sz w:val="26"/>
                 <w:szCs w:val="26"/>
               </w:rPr>
@@ -669,7 +611,6 @@
               <w:spacing w:line="312" w:lineRule="auto"/>
               <w:rPr>
                 <w:rFonts w:cs="Times New Roman"/>
-                <w:color w:val="000000" w:themeColor="text1"/>
                 <w:sz w:val="26"/>
                 <w:szCs w:val="26"/>
               </w:rPr>
@@ -677,7 +618,6 @@
             <w:r>
               <w:rPr>
                 <w:rFonts w:cs="Times New Roman"/>
-                <w:color w:val="000000" w:themeColor="text1"/>
                 <w:sz w:val="26"/>
                 <w:szCs w:val="26"/>
               </w:rPr>
@@ -692,7 +632,16 @@
         <w:spacing w:line="312" w:lineRule="auto"/>
         <w:rPr>
           <w:rFonts w:cs="Times New Roman"/>
-          <w:color w:val="000000" w:themeColor="text1"/>
+          <w:sz w:val="26"/>
+          <w:szCs w:val="26"/>
+        </w:rPr>
+      </w:pPr>
+    </w:p>
+    <w:p>
+      <w:pPr>
+        <w:spacing w:line="312" w:lineRule="auto"/>
+        <w:rPr>
+          <w:rFonts w:cs="Times New Roman"/>
           <w:sz w:val="26"/>
           <w:szCs w:val="26"/>
         </w:rPr>
@@ -704,7 +653,7 @@
         <w:spacing w:line="312" w:lineRule="auto"/>
         <w:rPr>
           <w:rFonts w:ascii="Times New Roman" w:hAnsi="Times New Roman" w:cs="Times New Roman"/>
-          <w:color w:val="000000" w:themeColor="text1"/>
+          <w:color w:val="auto"/>
           <w:sz w:val="26"/>
           <w:szCs w:val="26"/>
         </w:rPr>
@@ -712,7 +661,7 @@
       <w:r>
         <w:rPr>
           <w:rFonts w:ascii="Times New Roman" w:hAnsi="Times New Roman" w:cs="Times New Roman"/>
-          <w:color w:val="000000" w:themeColor="text1"/>
+          <w:color w:val="auto"/>
           <w:sz w:val="26"/>
           <w:szCs w:val="26"/>
         </w:rPr>
@@ -725,7 +674,6 @@
         <w:spacing w:line="312" w:lineRule="auto"/>
         <w:rPr>
           <w:rFonts w:cs="Times New Roman"/>
-          <w:color w:val="000000" w:themeColor="text1"/>
           <w:sz w:val="26"/>
           <w:szCs w:val="26"/>
         </w:rPr>
@@ -733,7 +681,42 @@
       <w:r>
         <w:rPr>
           <w:rFonts w:cs="Times New Roman"/>
-          <w:color w:val="000000" w:themeColor="text1"/>
+          <w:sz w:val="26"/>
+          <w:szCs w:val="26"/>
+        </w:rPr>
+        <w:t>Các đóng góp chính của nhóm gồm: (1) xây dựng quy trình tiền xử lý có thể tái lập cho dữ liệu hỗn hợp; (2) thiết kế các đặc trưng tổng hợp phản ánh diện tích, tuổi và chất lượng căn nhà; (3) so sánh Random Forest bằng scikit-learn với MLP bằng PyTorch; và (4) thực nghiệm chọn đặc trưng, đánh giá bằng metric và tạo file submission.</w:t>
+      </w:r>
+    </w:p>
+    <w:p>
+      <w:pPr>
+        <w:spacing w:line="312" w:lineRule="auto"/>
+        <w:rPr>
+          <w:rFonts w:cs="Times New Roman"/>
+          <w:sz w:val="26"/>
+          <w:szCs w:val="26"/>
+        </w:rPr>
+      </w:pPr>
+      <w:r>
+        <w:rPr>
+          <w:rFonts w:cs="Times New Roman"/>
+          <w:sz w:val="26"/>
+          <w:szCs w:val="26"/>
+        </w:rPr>
+        <w:t>Ý nghĩa thực tiễn: Dự đoán giá nhà hỗ trợ người mua, người bán và các tổ chức bất động sản có thêm một cơ sở định lượng khi tham khảo giá. Mô hình cũng cho thấy cách dữ liệu mô tả một căn nhà có thể được chuyển thành thông tin phục vụ ra quyết định.</w:t>
+      </w:r>
+    </w:p>
+    <w:p>
+      <w:pPr>
+        <w:spacing w:line="312" w:lineRule="auto"/>
+        <w:rPr>
+          <w:rFonts w:cs="Times New Roman"/>
+          <w:sz w:val="26"/>
+          <w:szCs w:val="26"/>
+        </w:rPr>
+      </w:pPr>
+      <w:r>
+        <w:rPr>
+          <w:rFonts w:cs="Times New Roman"/>
           <w:sz w:val="26"/>
           <w:szCs w:val="26"/>
         </w:rPr>
@@ -745,7 +728,6 @@
         <w:spacing w:line="312" w:lineRule="auto"/>
         <w:rPr>
           <w:rFonts w:cs="Times New Roman"/>
-          <w:color w:val="000000" w:themeColor="text1"/>
           <w:sz w:val="26"/>
           <w:szCs w:val="26"/>
         </w:rPr>
@@ -753,7 +735,6 @@
       <w:r>
         <w:rPr>
           <w:rFonts w:cs="Times New Roman"/>
-          <w:color w:val="000000" w:themeColor="text1"/>
           <w:sz w:val="26"/>
           <w:szCs w:val="26"/>
         </w:rPr>
@@ -766,7 +747,7 @@
         <w:spacing w:line="312" w:lineRule="auto"/>
         <w:rPr>
           <w:rFonts w:ascii="Times New Roman" w:hAnsi="Times New Roman" w:cs="Times New Roman"/>
-          <w:color w:val="000000" w:themeColor="text1"/>
+          <w:color w:val="auto"/>
           <w:sz w:val="26"/>
           <w:szCs w:val="26"/>
         </w:rPr>
@@ -774,7 +755,7 @@
       <w:r>
         <w:rPr>
           <w:rFonts w:ascii="Times New Roman" w:hAnsi="Times New Roman" w:cs="Times New Roman"/>
-          <w:color w:val="000000" w:themeColor="text1"/>
+          <w:color w:val="auto"/>
           <w:sz w:val="26"/>
           <w:szCs w:val="26"/>
         </w:rPr>
@@ -787,13 +768,13 @@
         <w:spacing w:line="312" w:lineRule="auto"/>
         <w:rPr>
           <w:rFonts w:ascii="Times New Roman" w:hAnsi="Times New Roman" w:cs="Times New Roman"/>
-          <w:color w:val="000000" w:themeColor="text1"/>
+          <w:color w:val="auto"/>
         </w:rPr>
       </w:pPr>
       <w:r>
         <w:rPr>
           <w:rFonts w:ascii="Times New Roman" w:hAnsi="Times New Roman" w:cs="Times New Roman"/>
-          <w:color w:val="000000" w:themeColor="text1"/>
+          <w:color w:val="auto"/>
         </w:rPr>
         <w:t>2.1. Task - Bài toán</w:t>
       </w:r>
@@ -803,7 +784,6 @@
         <w:spacing w:line="312" w:lineRule="auto"/>
         <w:rPr>
           <w:rFonts w:cs="Times New Roman"/>
-          <w:color w:val="000000" w:themeColor="text1"/>
           <w:sz w:val="26"/>
           <w:szCs w:val="26"/>
         </w:rPr>
@@ -811,7 +791,6 @@
       <w:r>
         <w:rPr>
           <w:rFonts w:cs="Times New Roman"/>
-          <w:color w:val="000000" w:themeColor="text1"/>
           <w:sz w:val="26"/>
           <w:szCs w:val="26"/>
         </w:rPr>
@@ -824,13 +803,13 @@
         <w:spacing w:line="312" w:lineRule="auto"/>
         <w:rPr>
           <w:rFonts w:ascii="Times New Roman" w:hAnsi="Times New Roman" w:cs="Times New Roman"/>
-          <w:color w:val="000000" w:themeColor="text1"/>
+          <w:color w:val="auto"/>
         </w:rPr>
       </w:pPr>
       <w:r>
         <w:rPr>
           <w:rFonts w:ascii="Times New Roman" w:hAnsi="Times New Roman" w:cs="Times New Roman"/>
-          <w:color w:val="000000" w:themeColor="text1"/>
+          <w:color w:val="auto"/>
         </w:rPr>
         <w:t>2.2. Performance - Tiêu chí đánh giá</w:t>
       </w:r>
@@ -840,7 +819,6 @@
         <w:spacing w:line="312" w:lineRule="auto"/>
         <w:rPr>
           <w:rFonts w:cs="Times New Roman"/>
-          <w:color w:val="000000" w:themeColor="text1"/>
           <w:sz w:val="26"/>
           <w:szCs w:val="26"/>
         </w:rPr>
@@ -848,7 +826,6 @@
       <w:r>
         <w:rPr>
           <w:rFonts w:cs="Times New Roman"/>
-          <w:color w:val="000000" w:themeColor="text1"/>
           <w:sz w:val="26"/>
           <w:szCs w:val="26"/>
         </w:rPr>
@@ -861,13 +838,13 @@
         <w:spacing w:line="312" w:lineRule="auto"/>
         <w:rPr>
           <w:rFonts w:ascii="Times New Roman" w:hAnsi="Times New Roman" w:cs="Times New Roman"/>
-          <w:color w:val="000000" w:themeColor="text1"/>
+          <w:color w:val="auto"/>
         </w:rPr>
       </w:pPr>
       <w:r>
         <w:rPr>
           <w:rFonts w:ascii="Times New Roman" w:hAnsi="Times New Roman" w:cs="Times New Roman"/>
-          <w:color w:val="000000" w:themeColor="text1"/>
+          <w:color w:val="auto"/>
         </w:rPr>
         <w:t>2.3. Experience - Dữ liệu huấn luyện</w:t>
       </w:r>
@@ -877,7 +854,6 @@
         <w:spacing w:line="312" w:lineRule="auto"/>
         <w:rPr>
           <w:rFonts w:cs="Times New Roman"/>
-          <w:color w:val="000000" w:themeColor="text1"/>
           <w:sz w:val="26"/>
           <w:szCs w:val="26"/>
         </w:rPr>
@@ -885,7 +861,6 @@
       <w:r>
         <w:rPr>
           <w:rFonts w:cs="Times New Roman"/>
-          <w:color w:val="000000" w:themeColor="text1"/>
           <w:sz w:val="26"/>
           <w:szCs w:val="26"/>
         </w:rPr>
@@ -914,7 +889,6 @@
               <w:spacing w:line="312" w:lineRule="auto"/>
               <w:rPr>
                 <w:rFonts w:cs="Times New Roman"/>
-                <w:color w:val="000000" w:themeColor="text1"/>
                 <w:sz w:val="26"/>
                 <w:szCs w:val="26"/>
               </w:rPr>
@@ -923,7 +897,6 @@
               <w:rPr>
                 <w:rFonts w:cs="Times New Roman"/>
                 <w:b/>
-                <w:color w:val="000000" w:themeColor="text1"/>
                 <w:sz w:val="26"/>
                 <w:szCs w:val="26"/>
               </w:rPr>
@@ -940,7 +913,6 @@
               <w:spacing w:line="312" w:lineRule="auto"/>
               <w:rPr>
                 <w:rFonts w:cs="Times New Roman"/>
-                <w:color w:val="000000" w:themeColor="text1"/>
                 <w:sz w:val="26"/>
                 <w:szCs w:val="26"/>
               </w:rPr>
@@ -949,7 +921,6 @@
               <w:rPr>
                 <w:rFonts w:cs="Times New Roman"/>
                 <w:b/>
-                <w:color w:val="000000" w:themeColor="text1"/>
                 <w:sz w:val="26"/>
                 <w:szCs w:val="26"/>
               </w:rPr>
@@ -966,7 +937,6 @@
               <w:spacing w:line="312" w:lineRule="auto"/>
               <w:rPr>
                 <w:rFonts w:cs="Times New Roman"/>
-                <w:color w:val="000000" w:themeColor="text1"/>
                 <w:sz w:val="26"/>
                 <w:szCs w:val="26"/>
               </w:rPr>
@@ -975,7 +945,6 @@
               <w:rPr>
                 <w:rFonts w:cs="Times New Roman"/>
                 <w:b/>
-                <w:color w:val="000000" w:themeColor="text1"/>
                 <w:sz w:val="26"/>
                 <w:szCs w:val="26"/>
               </w:rPr>
@@ -992,7 +961,6 @@
               <w:spacing w:line="312" w:lineRule="auto"/>
               <w:rPr>
                 <w:rFonts w:cs="Times New Roman"/>
-                <w:color w:val="000000" w:themeColor="text1"/>
                 <w:sz w:val="26"/>
                 <w:szCs w:val="26"/>
               </w:rPr>
@@ -1001,7 +969,6 @@
               <w:rPr>
                 <w:rFonts w:cs="Times New Roman"/>
                 <w:b/>
-                <w:color w:val="000000" w:themeColor="text1"/>
                 <w:sz w:val="26"/>
                 <w:szCs w:val="26"/>
               </w:rPr>
@@ -1020,7 +987,6 @@
               <w:spacing w:line="312" w:lineRule="auto"/>
               <w:rPr>
                 <w:rFonts w:cs="Times New Roman"/>
-                <w:color w:val="000000" w:themeColor="text1"/>
                 <w:sz w:val="26"/>
                 <w:szCs w:val="26"/>
               </w:rPr>
@@ -1028,7 +994,6 @@
             <w:r>
               <w:rPr>
                 <w:rFonts w:cs="Times New Roman"/>
-                <w:color w:val="000000" w:themeColor="text1"/>
                 <w:sz w:val="26"/>
                 <w:szCs w:val="26"/>
               </w:rPr>
@@ -1045,7 +1010,6 @@
               <w:spacing w:line="312" w:lineRule="auto"/>
               <w:rPr>
                 <w:rFonts w:cs="Times New Roman"/>
-                <w:color w:val="000000" w:themeColor="text1"/>
                 <w:sz w:val="26"/>
                 <w:szCs w:val="26"/>
               </w:rPr>
@@ -1053,7 +1017,6 @@
             <w:r>
               <w:rPr>
                 <w:rFonts w:cs="Times New Roman"/>
-                <w:color w:val="000000" w:themeColor="text1"/>
                 <w:sz w:val="26"/>
                 <w:szCs w:val="26"/>
               </w:rPr>
@@ -1070,7 +1033,6 @@
               <w:spacing w:line="312" w:lineRule="auto"/>
               <w:rPr>
                 <w:rFonts w:cs="Times New Roman"/>
-                <w:color w:val="000000" w:themeColor="text1"/>
                 <w:sz w:val="26"/>
                 <w:szCs w:val="26"/>
               </w:rPr>
@@ -1078,7 +1040,6 @@
             <w:r>
               <w:rPr>
                 <w:rFonts w:cs="Times New Roman"/>
-                <w:color w:val="000000" w:themeColor="text1"/>
                 <w:sz w:val="26"/>
                 <w:szCs w:val="26"/>
               </w:rPr>
@@ -1095,7 +1056,6 @@
               <w:spacing w:line="312" w:lineRule="auto"/>
               <w:rPr>
                 <w:rFonts w:cs="Times New Roman"/>
-                <w:color w:val="000000" w:themeColor="text1"/>
                 <w:sz w:val="26"/>
                 <w:szCs w:val="26"/>
               </w:rPr>
@@ -1103,7 +1063,6 @@
             <w:r>
               <w:rPr>
                 <w:rFonts w:cs="Times New Roman"/>
-                <w:color w:val="000000" w:themeColor="text1"/>
                 <w:sz w:val="26"/>
                 <w:szCs w:val="26"/>
               </w:rPr>
@@ -1122,7 +1081,6 @@
               <w:spacing w:line="312" w:lineRule="auto"/>
               <w:rPr>
                 <w:rFonts w:cs="Times New Roman"/>
-                <w:color w:val="000000" w:themeColor="text1"/>
                 <w:sz w:val="26"/>
                 <w:szCs w:val="26"/>
               </w:rPr>
@@ -1130,7 +1088,6 @@
             <w:r>
               <w:rPr>
                 <w:rFonts w:cs="Times New Roman"/>
-                <w:color w:val="000000" w:themeColor="text1"/>
                 <w:sz w:val="26"/>
                 <w:szCs w:val="26"/>
               </w:rPr>
@@ -1147,7 +1104,6 @@
               <w:spacing w:line="312" w:lineRule="auto"/>
               <w:rPr>
                 <w:rFonts w:cs="Times New Roman"/>
-                <w:color w:val="000000" w:themeColor="text1"/>
                 <w:sz w:val="26"/>
                 <w:szCs w:val="26"/>
               </w:rPr>
@@ -1155,7 +1111,6 @@
             <w:r>
               <w:rPr>
                 <w:rFonts w:cs="Times New Roman"/>
-                <w:color w:val="000000" w:themeColor="text1"/>
                 <w:sz w:val="26"/>
                 <w:szCs w:val="26"/>
               </w:rPr>
@@ -1172,7 +1127,6 @@
               <w:spacing w:line="312" w:lineRule="auto"/>
               <w:rPr>
                 <w:rFonts w:cs="Times New Roman"/>
-                <w:color w:val="000000" w:themeColor="text1"/>
                 <w:sz w:val="26"/>
                 <w:szCs w:val="26"/>
               </w:rPr>
@@ -1180,7 +1134,6 @@
             <w:r>
               <w:rPr>
                 <w:rFonts w:cs="Times New Roman"/>
-                <w:color w:val="000000" w:themeColor="text1"/>
                 <w:sz w:val="26"/>
                 <w:szCs w:val="26"/>
               </w:rPr>
@@ -1197,7 +1150,6 @@
               <w:spacing w:line="312" w:lineRule="auto"/>
               <w:rPr>
                 <w:rFonts w:cs="Times New Roman"/>
-                <w:color w:val="000000" w:themeColor="text1"/>
                 <w:sz w:val="26"/>
                 <w:szCs w:val="26"/>
               </w:rPr>
@@ -1205,7 +1157,6 @@
             <w:r>
               <w:rPr>
                 <w:rFonts w:cs="Times New Roman"/>
-                <w:color w:val="000000" w:themeColor="text1"/>
                 <w:sz w:val="26"/>
                 <w:szCs w:val="26"/>
               </w:rPr>
@@ -1221,7 +1172,7 @@
         <w:spacing w:line="312" w:lineRule="auto"/>
         <w:rPr>
           <w:rFonts w:ascii="Times New Roman" w:hAnsi="Times New Roman" w:cs="Times New Roman"/>
-          <w:color w:val="000000" w:themeColor="text1"/>
+          <w:color w:val="auto"/>
           <w:sz w:val="26"/>
           <w:szCs w:val="26"/>
         </w:rPr>
@@ -1229,10 +1180,11 @@
       <w:r>
         <w:rPr>
           <w:rFonts w:ascii="Times New Roman" w:hAnsi="Times New Roman" w:cs="Times New Roman"/>
-          <w:color w:val="000000" w:themeColor="text1"/>
+          <w:color w:val="auto"/>
           <w:sz w:val="26"/>
           <w:szCs w:val="26"/>
         </w:rPr>
+        <w:lastRenderedPageBreak/>
         <w:t>3. Tiền xử lý dữ liệu</w:t>
       </w:r>
     </w:p>
@@ -1241,7 +1193,6 @@
         <w:spacing w:line="312" w:lineRule="auto"/>
         <w:rPr>
           <w:rFonts w:cs="Times New Roman"/>
-          <w:color w:val="000000" w:themeColor="text1"/>
           <w:sz w:val="26"/>
           <w:szCs w:val="26"/>
         </w:rPr>
@@ -1249,7 +1200,6 @@
       <w:r>
         <w:rPr>
           <w:rFonts w:cs="Times New Roman"/>
-          <w:color w:val="000000" w:themeColor="text1"/>
           <w:sz w:val="26"/>
           <w:szCs w:val="26"/>
         </w:rPr>
@@ -1262,7 +1212,6 @@
         <w:spacing w:line="312" w:lineRule="auto"/>
         <w:rPr>
           <w:rFonts w:cs="Times New Roman"/>
-          <w:color w:val="000000" w:themeColor="text1"/>
           <w:sz w:val="26"/>
           <w:szCs w:val="26"/>
         </w:rPr>
@@ -1270,7 +1219,6 @@
       <w:r>
         <w:rPr>
           <w:rFonts w:cs="Times New Roman"/>
-          <w:color w:val="000000" w:themeColor="text1"/>
           <w:sz w:val="26"/>
           <w:szCs w:val="26"/>
         </w:rPr>
@@ -1283,7 +1231,6 @@
         <w:spacing w:line="312" w:lineRule="auto"/>
         <w:rPr>
           <w:rFonts w:cs="Times New Roman"/>
-          <w:color w:val="000000" w:themeColor="text1"/>
           <w:sz w:val="26"/>
           <w:szCs w:val="26"/>
         </w:rPr>
@@ -1291,7 +1238,6 @@
       <w:r>
         <w:rPr>
           <w:rFonts w:cs="Times New Roman"/>
-          <w:color w:val="000000" w:themeColor="text1"/>
           <w:sz w:val="26"/>
           <w:szCs w:val="26"/>
         </w:rPr>
@@ -1304,7 +1250,6 @@
         <w:spacing w:line="312" w:lineRule="auto"/>
         <w:rPr>
           <w:rFonts w:cs="Times New Roman"/>
-          <w:color w:val="000000" w:themeColor="text1"/>
           <w:sz w:val="26"/>
           <w:szCs w:val="26"/>
         </w:rPr>
@@ -1312,7 +1257,6 @@
       <w:r>
         <w:rPr>
           <w:rFonts w:cs="Times New Roman"/>
-          <w:color w:val="000000" w:themeColor="text1"/>
           <w:sz w:val="26"/>
           <w:szCs w:val="26"/>
         </w:rPr>
@@ -1325,7 +1269,6 @@
         <w:spacing w:line="312" w:lineRule="auto"/>
         <w:rPr>
           <w:rFonts w:cs="Times New Roman"/>
-          <w:color w:val="000000" w:themeColor="text1"/>
           <w:sz w:val="26"/>
           <w:szCs w:val="26"/>
         </w:rPr>
@@ -1333,7 +1276,6 @@
       <w:r>
         <w:rPr>
           <w:rFonts w:cs="Times New Roman"/>
-          <w:color w:val="000000" w:themeColor="text1"/>
           <w:sz w:val="26"/>
           <w:szCs w:val="26"/>
         </w:rPr>
@@ -1346,7 +1288,6 @@
         <w:spacing w:line="312" w:lineRule="auto"/>
         <w:rPr>
           <w:rFonts w:cs="Times New Roman"/>
-          <w:color w:val="000000" w:themeColor="text1"/>
           <w:sz w:val="26"/>
           <w:szCs w:val="26"/>
         </w:rPr>
@@ -1354,11 +1295,9 @@
       <w:r>
         <w:rPr>
           <w:rFonts w:cs="Times New Roman"/>
-          <w:color w:val="000000" w:themeColor="text1"/>
           <w:sz w:val="26"/>
           <w:szCs w:val="26"/>
         </w:rPr>
-        <w:lastRenderedPageBreak/>
         <w:t>Target SalePrice được biến đổi bằng log1p khi huấn luyện; dự đoán được đưa về thang giá gốc bằng expm1.</w:t>
       </w:r>
     </w:p>
@@ -1368,7 +1307,7 @@
         <w:spacing w:line="312" w:lineRule="auto"/>
         <w:rPr>
           <w:rFonts w:ascii="Times New Roman" w:hAnsi="Times New Roman" w:cs="Times New Roman"/>
-          <w:color w:val="000000" w:themeColor="text1"/>
+          <w:color w:val="auto"/>
           <w:sz w:val="26"/>
           <w:szCs w:val="26"/>
         </w:rPr>
@@ -1376,7 +1315,7 @@
       <w:r>
         <w:rPr>
           <w:rFonts w:ascii="Times New Roman" w:hAnsi="Times New Roman" w:cs="Times New Roman"/>
-          <w:color w:val="000000" w:themeColor="text1"/>
+          <w:color w:val="auto"/>
           <w:sz w:val="26"/>
           <w:szCs w:val="26"/>
         </w:rPr>
@@ -1388,7 +1327,6 @@
         <w:spacing w:line="312" w:lineRule="auto"/>
         <w:rPr>
           <w:rFonts w:cs="Times New Roman"/>
-          <w:color w:val="000000" w:themeColor="text1"/>
           <w:sz w:val="26"/>
           <w:szCs w:val="26"/>
         </w:rPr>
@@ -1396,7 +1334,42 @@
       <w:r>
         <w:rPr>
           <w:rFonts w:cs="Times New Roman"/>
-          <w:color w:val="000000" w:themeColor="text1"/>
+          <w:sz w:val="26"/>
+          <w:szCs w:val="26"/>
+        </w:rPr>
+        <w:t>Các đặc trưng bất biến không có nghĩa là hoàn toàn không đổi trong mọi tình huống; chúng là các đại lượng tổng hợp ít phụ thuộc vào cách mã hóa hoặc phân chia dữ liệu ban đầu, đồng thời vẫn giữ ý nghĩa vật lý của đối tượng. Đây là lý do nhóm ưu tiên các biến tổng diện tích, tuổi và tương tác chất lượng-diện tích.</w:t>
+      </w:r>
+    </w:p>
+    <w:p>
+      <w:pPr>
+        <w:spacing w:line="312" w:lineRule="auto"/>
+        <w:rPr>
+          <w:rFonts w:cs="Times New Roman"/>
+          <w:sz w:val="26"/>
+          <w:szCs w:val="26"/>
+        </w:rPr>
+      </w:pPr>
+      <w:r>
+        <w:rPr>
+          <w:rFonts w:cs="Times New Roman"/>
+          <w:sz w:val="26"/>
+          <w:szCs w:val="26"/>
+        </w:rPr>
+        <w:t>Góc độ đặc trưng bất biến: các đặc trưng tổng hợp được chọn để giữ lại thông tin bản chất của căn nhà khi cách biểu diễn ban đầu thay đổi. Ví dụ, tổng diện tích TotalSF vẫn phản ánh quy mô căn nhà dù diện tích được chia ở các cột tầng hầm, tầng 1 và tầng 2; HouseAge vẫn phản ánh tuổi nhà dù năm xây dựng khác nhau giữa các bản ghi; TotalBathrooms giảm sự phụ thuộc vào cách tách phòng tắm đầy đủ và bán phần. Vì vậy, các đặc trưng này có tính ổn định và dễ diễn giải hơn so với chỉ dùng từng cột riêng lẻ.</w:t>
+      </w:r>
+    </w:p>
+    <w:p>
+      <w:pPr>
+        <w:spacing w:line="312" w:lineRule="auto"/>
+        <w:rPr>
+          <w:rFonts w:cs="Times New Roman"/>
+          <w:sz w:val="26"/>
+          <w:szCs w:val="26"/>
+        </w:rPr>
+      </w:pPr>
+      <w:r>
+        <w:rPr>
+          <w:rFonts w:cs="Times New Roman"/>
           <w:sz w:val="26"/>
           <w:szCs w:val="26"/>
         </w:rPr>
@@ -1423,7 +1396,6 @@
               <w:spacing w:line="312" w:lineRule="auto"/>
               <w:rPr>
                 <w:rFonts w:cs="Times New Roman"/>
-                <w:color w:val="000000" w:themeColor="text1"/>
                 <w:sz w:val="26"/>
                 <w:szCs w:val="26"/>
               </w:rPr>
@@ -1432,7 +1404,6 @@
               <w:rPr>
                 <w:rFonts w:cs="Times New Roman"/>
                 <w:b/>
-                <w:color w:val="000000" w:themeColor="text1"/>
                 <w:sz w:val="26"/>
                 <w:szCs w:val="26"/>
               </w:rPr>
@@ -1449,7 +1420,6 @@
               <w:spacing w:line="312" w:lineRule="auto"/>
               <w:rPr>
                 <w:rFonts w:cs="Times New Roman"/>
-                <w:color w:val="000000" w:themeColor="text1"/>
                 <w:sz w:val="26"/>
                 <w:szCs w:val="26"/>
               </w:rPr>
@@ -1458,7 +1428,6 @@
               <w:rPr>
                 <w:rFonts w:cs="Times New Roman"/>
                 <w:b/>
-                <w:color w:val="000000" w:themeColor="text1"/>
                 <w:sz w:val="26"/>
                 <w:szCs w:val="26"/>
               </w:rPr>
@@ -1477,7 +1446,6 @@
               <w:spacing w:line="312" w:lineRule="auto"/>
               <w:rPr>
                 <w:rFonts w:cs="Times New Roman"/>
-                <w:color w:val="000000" w:themeColor="text1"/>
                 <w:sz w:val="26"/>
                 <w:szCs w:val="26"/>
               </w:rPr>
@@ -1485,7 +1453,6 @@
             <w:r>
               <w:rPr>
                 <w:rFonts w:cs="Times New Roman"/>
-                <w:color w:val="000000" w:themeColor="text1"/>
                 <w:sz w:val="26"/>
                 <w:szCs w:val="26"/>
               </w:rPr>
@@ -1502,7 +1469,6 @@
               <w:spacing w:line="312" w:lineRule="auto"/>
               <w:rPr>
                 <w:rFonts w:cs="Times New Roman"/>
-                <w:color w:val="000000" w:themeColor="text1"/>
                 <w:sz w:val="26"/>
                 <w:szCs w:val="26"/>
               </w:rPr>
@@ -1510,7 +1476,6 @@
             <w:r>
               <w:rPr>
                 <w:rFonts w:cs="Times New Roman"/>
-                <w:color w:val="000000" w:themeColor="text1"/>
                 <w:sz w:val="26"/>
                 <w:szCs w:val="26"/>
               </w:rPr>
@@ -1529,7 +1494,6 @@
               <w:spacing w:line="312" w:lineRule="auto"/>
               <w:rPr>
                 <w:rFonts w:cs="Times New Roman"/>
-                <w:color w:val="000000" w:themeColor="text1"/>
                 <w:sz w:val="26"/>
                 <w:szCs w:val="26"/>
               </w:rPr>
@@ -1537,7 +1501,6 @@
             <w:r>
               <w:rPr>
                 <w:rFonts w:cs="Times New Roman"/>
-                <w:color w:val="000000" w:themeColor="text1"/>
                 <w:sz w:val="26"/>
                 <w:szCs w:val="26"/>
               </w:rPr>
@@ -1554,7 +1517,6 @@
               <w:spacing w:line="312" w:lineRule="auto"/>
               <w:rPr>
                 <w:rFonts w:cs="Times New Roman"/>
-                <w:color w:val="000000" w:themeColor="text1"/>
                 <w:sz w:val="26"/>
                 <w:szCs w:val="26"/>
               </w:rPr>
@@ -1562,7 +1524,6 @@
             <w:r>
               <w:rPr>
                 <w:rFonts w:cs="Times New Roman"/>
-                <w:color w:val="000000" w:themeColor="text1"/>
                 <w:sz w:val="26"/>
                 <w:szCs w:val="26"/>
               </w:rPr>
@@ -1581,7 +1542,6 @@
               <w:spacing w:line="312" w:lineRule="auto"/>
               <w:rPr>
                 <w:rFonts w:cs="Times New Roman"/>
-                <w:color w:val="000000" w:themeColor="text1"/>
                 <w:sz w:val="26"/>
                 <w:szCs w:val="26"/>
               </w:rPr>
@@ -1589,7 +1549,6 @@
             <w:r>
               <w:rPr>
                 <w:rFonts w:cs="Times New Roman"/>
-                <w:color w:val="000000" w:themeColor="text1"/>
                 <w:sz w:val="26"/>
                 <w:szCs w:val="26"/>
               </w:rPr>
@@ -1606,7 +1565,6 @@
               <w:spacing w:line="312" w:lineRule="auto"/>
               <w:rPr>
                 <w:rFonts w:cs="Times New Roman"/>
-                <w:color w:val="000000" w:themeColor="text1"/>
                 <w:sz w:val="26"/>
                 <w:szCs w:val="26"/>
               </w:rPr>
@@ -1614,7 +1572,6 @@
             <w:r>
               <w:rPr>
                 <w:rFonts w:cs="Times New Roman"/>
-                <w:color w:val="000000" w:themeColor="text1"/>
                 <w:sz w:val="26"/>
                 <w:szCs w:val="26"/>
               </w:rPr>
@@ -1633,7 +1590,6 @@
               <w:spacing w:line="312" w:lineRule="auto"/>
               <w:rPr>
                 <w:rFonts w:cs="Times New Roman"/>
-                <w:color w:val="000000" w:themeColor="text1"/>
                 <w:sz w:val="26"/>
                 <w:szCs w:val="26"/>
               </w:rPr>
@@ -1641,7 +1597,6 @@
             <w:r>
               <w:rPr>
                 <w:rFonts w:cs="Times New Roman"/>
-                <w:color w:val="000000" w:themeColor="text1"/>
                 <w:sz w:val="26"/>
                 <w:szCs w:val="26"/>
               </w:rPr>
@@ -1658,7 +1613,6 @@
               <w:spacing w:line="312" w:lineRule="auto"/>
               <w:rPr>
                 <w:rFonts w:cs="Times New Roman"/>
-                <w:color w:val="000000" w:themeColor="text1"/>
                 <w:sz w:val="26"/>
                 <w:szCs w:val="26"/>
               </w:rPr>
@@ -1666,7 +1620,6 @@
             <w:r>
               <w:rPr>
                 <w:rFonts w:cs="Times New Roman"/>
-                <w:color w:val="000000" w:themeColor="text1"/>
                 <w:sz w:val="26"/>
                 <w:szCs w:val="26"/>
               </w:rPr>
@@ -1685,7 +1638,6 @@
               <w:spacing w:line="312" w:lineRule="auto"/>
               <w:rPr>
                 <w:rFonts w:cs="Times New Roman"/>
-                <w:color w:val="000000" w:themeColor="text1"/>
                 <w:sz w:val="26"/>
                 <w:szCs w:val="26"/>
               </w:rPr>
@@ -1693,7 +1645,6 @@
             <w:r>
               <w:rPr>
                 <w:rFonts w:cs="Times New Roman"/>
-                <w:color w:val="000000" w:themeColor="text1"/>
                 <w:sz w:val="26"/>
                 <w:szCs w:val="26"/>
               </w:rPr>
@@ -1710,7 +1661,6 @@
               <w:spacing w:line="312" w:lineRule="auto"/>
               <w:rPr>
                 <w:rFonts w:cs="Times New Roman"/>
-                <w:color w:val="000000" w:themeColor="text1"/>
                 <w:sz w:val="26"/>
                 <w:szCs w:val="26"/>
               </w:rPr>
@@ -1718,7 +1668,6 @@
             <w:r>
               <w:rPr>
                 <w:rFonts w:cs="Times New Roman"/>
-                <w:color w:val="000000" w:themeColor="text1"/>
                 <w:sz w:val="26"/>
                 <w:szCs w:val="26"/>
               </w:rPr>
@@ -1737,7 +1686,6 @@
               <w:spacing w:line="312" w:lineRule="auto"/>
               <w:rPr>
                 <w:rFonts w:cs="Times New Roman"/>
-                <w:color w:val="000000" w:themeColor="text1"/>
                 <w:sz w:val="26"/>
                 <w:szCs w:val="26"/>
               </w:rPr>
@@ -1745,10 +1693,10 @@
             <w:r>
               <w:rPr>
                 <w:rFonts w:cs="Times New Roman"/>
-                <w:color w:val="000000" w:themeColor="text1"/>
                 <w:sz w:val="26"/>
                 <w:szCs w:val="26"/>
               </w:rPr>
+              <w:lastRenderedPageBreak/>
               <w:t>RemodAge</w:t>
             </w:r>
           </w:p>
@@ -1762,7 +1710,6 @@
               <w:spacing w:line="312" w:lineRule="auto"/>
               <w:rPr>
                 <w:rFonts w:cs="Times New Roman"/>
-                <w:color w:val="000000" w:themeColor="text1"/>
                 <w:sz w:val="26"/>
                 <w:szCs w:val="26"/>
               </w:rPr>
@@ -1770,7 +1717,6 @@
             <w:r>
               <w:rPr>
                 <w:rFonts w:cs="Times New Roman"/>
-                <w:color w:val="000000" w:themeColor="text1"/>
                 <w:sz w:val="26"/>
                 <w:szCs w:val="26"/>
               </w:rPr>
@@ -1789,7 +1735,6 @@
               <w:spacing w:line="312" w:lineRule="auto"/>
               <w:rPr>
                 <w:rFonts w:cs="Times New Roman"/>
-                <w:color w:val="000000" w:themeColor="text1"/>
                 <w:sz w:val="26"/>
                 <w:szCs w:val="26"/>
               </w:rPr>
@@ -1797,7 +1742,6 @@
             <w:r>
               <w:rPr>
                 <w:rFonts w:cs="Times New Roman"/>
-                <w:color w:val="000000" w:themeColor="text1"/>
                 <w:sz w:val="26"/>
                 <w:szCs w:val="26"/>
               </w:rPr>
@@ -1814,7 +1758,6 @@
               <w:spacing w:line="312" w:lineRule="auto"/>
               <w:rPr>
                 <w:rFonts w:cs="Times New Roman"/>
-                <w:color w:val="000000" w:themeColor="text1"/>
                 <w:sz w:val="26"/>
                 <w:szCs w:val="26"/>
               </w:rPr>
@@ -1822,7 +1765,6 @@
             <w:r>
               <w:rPr>
                 <w:rFonts w:cs="Times New Roman"/>
-                <w:color w:val="000000" w:themeColor="text1"/>
                 <w:sz w:val="26"/>
                 <w:szCs w:val="26"/>
               </w:rPr>
@@ -1841,7 +1783,6 @@
               <w:spacing w:line="312" w:lineRule="auto"/>
               <w:rPr>
                 <w:rFonts w:cs="Times New Roman"/>
-                <w:color w:val="000000" w:themeColor="text1"/>
                 <w:sz w:val="26"/>
                 <w:szCs w:val="26"/>
               </w:rPr>
@@ -1849,7 +1790,6 @@
             <w:r>
               <w:rPr>
                 <w:rFonts w:cs="Times New Roman"/>
-                <w:color w:val="000000" w:themeColor="text1"/>
                 <w:sz w:val="26"/>
                 <w:szCs w:val="26"/>
               </w:rPr>
@@ -1866,7 +1806,6 @@
               <w:spacing w:line="312" w:lineRule="auto"/>
               <w:rPr>
                 <w:rFonts w:cs="Times New Roman"/>
-                <w:color w:val="000000" w:themeColor="text1"/>
                 <w:sz w:val="26"/>
                 <w:szCs w:val="26"/>
               </w:rPr>
@@ -1874,7 +1813,6 @@
             <w:r>
               <w:rPr>
                 <w:rFonts w:cs="Times New Roman"/>
-                <w:color w:val="000000" w:themeColor="text1"/>
                 <w:sz w:val="26"/>
                 <w:szCs w:val="26"/>
               </w:rPr>
@@ -1893,7 +1831,6 @@
               <w:spacing w:line="312" w:lineRule="auto"/>
               <w:rPr>
                 <w:rFonts w:cs="Times New Roman"/>
-                <w:color w:val="000000" w:themeColor="text1"/>
                 <w:sz w:val="26"/>
                 <w:szCs w:val="26"/>
               </w:rPr>
@@ -1901,7 +1838,6 @@
             <w:r>
               <w:rPr>
                 <w:rFonts w:cs="Times New Roman"/>
-                <w:color w:val="000000" w:themeColor="text1"/>
                 <w:sz w:val="26"/>
                 <w:szCs w:val="26"/>
               </w:rPr>
@@ -1918,7 +1854,6 @@
               <w:spacing w:line="312" w:lineRule="auto"/>
               <w:rPr>
                 <w:rFonts w:cs="Times New Roman"/>
-                <w:color w:val="000000" w:themeColor="text1"/>
                 <w:sz w:val="26"/>
                 <w:szCs w:val="26"/>
               </w:rPr>
@@ -1926,7 +1861,6 @@
             <w:r>
               <w:rPr>
                 <w:rFonts w:cs="Times New Roman"/>
-                <w:color w:val="000000" w:themeColor="text1"/>
                 <w:sz w:val="26"/>
                 <w:szCs w:val="26"/>
               </w:rPr>
@@ -1941,7 +1875,6 @@
         <w:spacing w:line="312" w:lineRule="auto"/>
         <w:rPr>
           <w:rFonts w:cs="Times New Roman"/>
-          <w:color w:val="000000" w:themeColor="text1"/>
           <w:sz w:val="26"/>
           <w:szCs w:val="26"/>
         </w:rPr>
@@ -1949,7 +1882,6 @@
       <w:r>
         <w:rPr>
           <w:rFonts w:cs="Times New Roman"/>
-          <w:color w:val="000000" w:themeColor="text1"/>
           <w:sz w:val="26"/>
           <w:szCs w:val="26"/>
         </w:rPr>
@@ -1962,7 +1894,7 @@
         <w:spacing w:line="312" w:lineRule="auto"/>
         <w:rPr>
           <w:rFonts w:ascii="Times New Roman" w:hAnsi="Times New Roman" w:cs="Times New Roman"/>
-          <w:color w:val="000000" w:themeColor="text1"/>
+          <w:color w:val="auto"/>
           <w:sz w:val="26"/>
           <w:szCs w:val="26"/>
         </w:rPr>
@@ -1970,7 +1902,7 @@
       <w:r>
         <w:rPr>
           <w:rFonts w:ascii="Times New Roman" w:hAnsi="Times New Roman" w:cs="Times New Roman"/>
-          <w:color w:val="000000" w:themeColor="text1"/>
+          <w:color w:val="auto"/>
           <w:sz w:val="26"/>
           <w:szCs w:val="26"/>
         </w:rPr>
@@ -1982,7 +1914,6 @@
         <w:spacing w:line="312" w:lineRule="auto"/>
         <w:rPr>
           <w:rFonts w:cs="Times New Roman"/>
-          <w:color w:val="000000" w:themeColor="text1"/>
           <w:sz w:val="26"/>
           <w:szCs w:val="26"/>
         </w:rPr>
@@ -1990,7 +1921,6 @@
       <w:r>
         <w:rPr>
           <w:rFonts w:cs="Times New Roman"/>
-          <w:color w:val="000000" w:themeColor="text1"/>
           <w:sz w:val="26"/>
           <w:szCs w:val="26"/>
         </w:rPr>
@@ -2002,7 +1932,6 @@
         <w:spacing w:line="312" w:lineRule="auto"/>
         <w:rPr>
           <w:rFonts w:cs="Times New Roman"/>
-          <w:color w:val="000000" w:themeColor="text1"/>
           <w:sz w:val="26"/>
           <w:szCs w:val="26"/>
         </w:rPr>
@@ -2010,7 +1939,6 @@
       <w:r>
         <w:rPr>
           <w:rFonts w:cs="Times New Roman"/>
-          <w:color w:val="000000" w:themeColor="text1"/>
           <w:sz w:val="26"/>
           <w:szCs w:val="26"/>
         </w:rPr>
@@ -2023,7 +1951,7 @@
         <w:spacing w:line="312" w:lineRule="auto"/>
         <w:rPr>
           <w:rFonts w:ascii="Times New Roman" w:hAnsi="Times New Roman" w:cs="Times New Roman"/>
-          <w:color w:val="000000" w:themeColor="text1"/>
+          <w:color w:val="auto"/>
           <w:sz w:val="26"/>
           <w:szCs w:val="26"/>
         </w:rPr>
@@ -2031,7 +1959,7 @@
       <w:r>
         <w:rPr>
           <w:rFonts w:ascii="Times New Roman" w:hAnsi="Times New Roman" w:cs="Times New Roman"/>
-          <w:color w:val="000000" w:themeColor="text1"/>
+          <w:color w:val="auto"/>
           <w:sz w:val="26"/>
           <w:szCs w:val="26"/>
         </w:rPr>
@@ -2043,7 +1971,6 @@
         <w:spacing w:line="312" w:lineRule="auto"/>
         <w:rPr>
           <w:rFonts w:cs="Times New Roman"/>
-          <w:color w:val="000000" w:themeColor="text1"/>
           <w:sz w:val="26"/>
           <w:szCs w:val="26"/>
         </w:rPr>
@@ -2051,7 +1978,6 @@
       <w:r>
         <w:rPr>
           <w:rFonts w:cs="Times New Roman"/>
-          <w:color w:val="000000" w:themeColor="text1"/>
           <w:sz w:val="26"/>
           <w:szCs w:val="26"/>
         </w:rPr>
@@ -2064,7 +1990,6 @@
         <w:spacing w:line="312" w:lineRule="auto"/>
         <w:rPr>
           <w:rFonts w:cs="Times New Roman"/>
-          <w:color w:val="000000" w:themeColor="text1"/>
           <w:sz w:val="26"/>
           <w:szCs w:val="26"/>
         </w:rPr>
@@ -2072,11 +1997,9 @@
       <w:r>
         <w:rPr>
           <w:rFonts w:cs="Times New Roman"/>
-          <w:color w:val="000000" w:themeColor="text1"/>
           <w:sz w:val="26"/>
           <w:szCs w:val="26"/>
         </w:rPr>
-        <w:lastRenderedPageBreak/>
         <w:t>Linear(input_dim, 256) + ReLU + BatchNorm + Dropout 0.2.</w:t>
       </w:r>
     </w:p>
@@ -2086,7 +2009,6 @@
         <w:spacing w:line="312" w:lineRule="auto"/>
         <w:rPr>
           <w:rFonts w:cs="Times New Roman"/>
-          <w:color w:val="000000" w:themeColor="text1"/>
           <w:sz w:val="26"/>
           <w:szCs w:val="26"/>
         </w:rPr>
@@ -2094,7 +2016,6 @@
       <w:r>
         <w:rPr>
           <w:rFonts w:cs="Times New Roman"/>
-          <w:color w:val="000000" w:themeColor="text1"/>
           <w:sz w:val="26"/>
           <w:szCs w:val="26"/>
         </w:rPr>
@@ -2107,7 +2028,6 @@
         <w:spacing w:line="312" w:lineRule="auto"/>
         <w:rPr>
           <w:rFonts w:cs="Times New Roman"/>
-          <w:color w:val="000000" w:themeColor="text1"/>
           <w:sz w:val="26"/>
           <w:szCs w:val="26"/>
         </w:rPr>
@@ -2115,7 +2035,6 @@
       <w:r>
         <w:rPr>
           <w:rFonts w:cs="Times New Roman"/>
-          <w:color w:val="000000" w:themeColor="text1"/>
           <w:sz w:val="26"/>
           <w:szCs w:val="26"/>
         </w:rPr>
@@ -2128,7 +2047,6 @@
         <w:spacing w:line="312" w:lineRule="auto"/>
         <w:rPr>
           <w:rFonts w:cs="Times New Roman"/>
-          <w:color w:val="000000" w:themeColor="text1"/>
           <w:sz w:val="26"/>
           <w:szCs w:val="26"/>
         </w:rPr>
@@ -2136,7 +2054,6 @@
       <w:r>
         <w:rPr>
           <w:rFonts w:cs="Times New Roman"/>
-          <w:color w:val="000000" w:themeColor="text1"/>
           <w:sz w:val="26"/>
           <w:szCs w:val="26"/>
         </w:rPr>
@@ -2149,7 +2066,6 @@
         <w:spacing w:line="312" w:lineRule="auto"/>
         <w:rPr>
           <w:rFonts w:cs="Times New Roman"/>
-          <w:color w:val="000000" w:themeColor="text1"/>
           <w:sz w:val="26"/>
           <w:szCs w:val="26"/>
         </w:rPr>
@@ -2157,7 +2073,6 @@
       <w:r>
         <w:rPr>
           <w:rFonts w:cs="Times New Roman"/>
-          <w:color w:val="000000" w:themeColor="text1"/>
           <w:sz w:val="26"/>
           <w:szCs w:val="26"/>
         </w:rPr>
@@ -2170,7 +2085,6 @@
         <w:spacing w:line="312" w:lineRule="auto"/>
         <w:rPr>
           <w:rFonts w:cs="Times New Roman"/>
-          <w:color w:val="000000" w:themeColor="text1"/>
           <w:sz w:val="26"/>
           <w:szCs w:val="26"/>
         </w:rPr>
@@ -2178,7 +2092,6 @@
       <w:r>
         <w:rPr>
           <w:rFonts w:cs="Times New Roman"/>
-          <w:color w:val="000000" w:themeColor="text1"/>
           <w:sz w:val="26"/>
           <w:szCs w:val="26"/>
         </w:rPr>
@@ -2190,7 +2103,6 @@
         <w:spacing w:line="312" w:lineRule="auto"/>
         <w:rPr>
           <w:rFonts w:cs="Times New Roman"/>
-          <w:color w:val="000000" w:themeColor="text1"/>
           <w:sz w:val="26"/>
           <w:szCs w:val="26"/>
         </w:rPr>
@@ -2198,7 +2110,6 @@
       <w:r>
         <w:rPr>
           <w:rFonts w:cs="Times New Roman"/>
-          <w:color w:val="000000" w:themeColor="text1"/>
           <w:sz w:val="26"/>
           <w:szCs w:val="26"/>
         </w:rPr>
@@ -2211,7 +2122,7 @@
         <w:spacing w:line="312" w:lineRule="auto"/>
         <w:rPr>
           <w:rFonts w:ascii="Times New Roman" w:hAnsi="Times New Roman" w:cs="Times New Roman"/>
-          <w:color w:val="000000" w:themeColor="text1"/>
+          <w:color w:val="auto"/>
           <w:sz w:val="26"/>
           <w:szCs w:val="26"/>
         </w:rPr>
@@ -2219,10 +2130,11 @@
       <w:r>
         <w:rPr>
           <w:rFonts w:ascii="Times New Roman" w:hAnsi="Times New Roman" w:cs="Times New Roman"/>
-          <w:color w:val="000000" w:themeColor="text1"/>
+          <w:color w:val="auto"/>
           <w:sz w:val="26"/>
           <w:szCs w:val="26"/>
         </w:rPr>
+        <w:lastRenderedPageBreak/>
         <w:t>7. Thực nghiệm và kết quả</w:t>
       </w:r>
     </w:p>
@@ -2231,7 +2143,6 @@
         <w:spacing w:line="312" w:lineRule="auto"/>
         <w:rPr>
           <w:rFonts w:cs="Times New Roman"/>
-          <w:color w:val="000000" w:themeColor="text1"/>
           <w:sz w:val="26"/>
           <w:szCs w:val="26"/>
         </w:rPr>
@@ -2239,7 +2150,42 @@
       <w:r>
         <w:rPr>
           <w:rFonts w:cs="Times New Roman"/>
-          <w:color w:val="000000" w:themeColor="text1"/>
+          <w:sz w:val="26"/>
+          <w:szCs w:val="26"/>
+        </w:rPr>
+        <w:t>Nguyên nhân chính gồm: (1) dữ liệu chỉ có 1460 mẫu, khá nhỏ so với số chiều sau one-hot; (2) nhiều biến categorical tạo ra ma trận đặc trưng thưa, trong khi MLP thường cần nhiều dữ liệu để học ổn định; (3) Random Forest học tốt quan hệ phi tuyến, ngưỡng và tương tác giữa các biến mà không cần mô hình hóa thủ công; (4) MLP nhạy với learning rate, kiến trúc, batch size và số epoch, nên cấu hình hiện tại có thể chưa tối ưu; và (5) dropout, regularization cùng early stopping giúp hạn chế overfitting nhưng cũng có thể làm mô hình chưa đủ năng lực học hết tín hiệu của tập train.</w:t>
+      </w:r>
+    </w:p>
+    <w:p>
+      <w:pPr>
+        <w:spacing w:line="312" w:lineRule="auto"/>
+        <w:rPr>
+          <w:rFonts w:cs="Times New Roman"/>
+          <w:sz w:val="26"/>
+          <w:szCs w:val="26"/>
+        </w:rPr>
+      </w:pPr>
+      <w:r>
+        <w:rPr>
+          <w:rFonts w:cs="Times New Roman"/>
+          <w:sz w:val="26"/>
+          <w:szCs w:val="26"/>
+        </w:rPr>
+        <w:t>Bình luận: Random Forest + SelectKBest đạt RMSE 28720.05 và R² 0.8925, tốt hơn rõ rệt so với MLP có RMSE 57075.14 và R² 0.5753. MLP vẫn giảm được sai số trong quá trình học nhưng chưa tổng quát tốt trên validation. Khoảng cách này cho thấy với cấu hình hiện tại, mô hình cây phù hợp hơn với dữ liệu bảng House Prices.</w:t>
+      </w:r>
+    </w:p>
+    <w:p>
+      <w:pPr>
+        <w:spacing w:line="312" w:lineRule="auto"/>
+        <w:rPr>
+          <w:rFonts w:cs="Times New Roman"/>
+          <w:sz w:val="26"/>
+          <w:szCs w:val="26"/>
+        </w:rPr>
+      </w:pPr>
+      <w:r>
+        <w:rPr>
+          <w:rFonts w:cs="Times New Roman"/>
           <w:sz w:val="26"/>
           <w:szCs w:val="26"/>
         </w:rPr>
@@ -2268,7 +2214,6 @@
               <w:spacing w:line="312" w:lineRule="auto"/>
               <w:rPr>
                 <w:rFonts w:cs="Times New Roman"/>
-                <w:color w:val="000000" w:themeColor="text1"/>
                 <w:sz w:val="26"/>
                 <w:szCs w:val="26"/>
               </w:rPr>
@@ -2277,7 +2222,6 @@
               <w:rPr>
                 <w:rFonts w:cs="Times New Roman"/>
                 <w:b/>
-                <w:color w:val="000000" w:themeColor="text1"/>
                 <w:sz w:val="26"/>
                 <w:szCs w:val="26"/>
               </w:rPr>
@@ -2294,7 +2238,6 @@
               <w:spacing w:line="312" w:lineRule="auto"/>
               <w:rPr>
                 <w:rFonts w:cs="Times New Roman"/>
-                <w:color w:val="000000" w:themeColor="text1"/>
                 <w:sz w:val="26"/>
                 <w:szCs w:val="26"/>
               </w:rPr>
@@ -2303,7 +2246,6 @@
               <w:rPr>
                 <w:rFonts w:cs="Times New Roman"/>
                 <w:b/>
-                <w:color w:val="000000" w:themeColor="text1"/>
                 <w:sz w:val="26"/>
                 <w:szCs w:val="26"/>
               </w:rPr>
@@ -2320,7 +2262,6 @@
               <w:spacing w:line="312" w:lineRule="auto"/>
               <w:rPr>
                 <w:rFonts w:cs="Times New Roman"/>
-                <w:color w:val="000000" w:themeColor="text1"/>
                 <w:sz w:val="26"/>
                 <w:szCs w:val="26"/>
               </w:rPr>
@@ -2329,7 +2270,6 @@
               <w:rPr>
                 <w:rFonts w:cs="Times New Roman"/>
                 <w:b/>
-                <w:color w:val="000000" w:themeColor="text1"/>
                 <w:sz w:val="26"/>
                 <w:szCs w:val="26"/>
               </w:rPr>
@@ -2346,7 +2286,6 @@
               <w:spacing w:line="312" w:lineRule="auto"/>
               <w:rPr>
                 <w:rFonts w:cs="Times New Roman"/>
-                <w:color w:val="000000" w:themeColor="text1"/>
                 <w:sz w:val="26"/>
                 <w:szCs w:val="26"/>
               </w:rPr>
@@ -2355,7 +2294,6 @@
               <w:rPr>
                 <w:rFonts w:cs="Times New Roman"/>
                 <w:b/>
-                <w:color w:val="000000" w:themeColor="text1"/>
                 <w:sz w:val="26"/>
                 <w:szCs w:val="26"/>
               </w:rPr>
@@ -2374,7 +2312,6 @@
               <w:spacing w:line="312" w:lineRule="auto"/>
               <w:rPr>
                 <w:rFonts w:cs="Times New Roman"/>
-                <w:color w:val="000000" w:themeColor="text1"/>
                 <w:sz w:val="26"/>
                 <w:szCs w:val="26"/>
               </w:rPr>
@@ -2382,7 +2319,6 @@
             <w:r>
               <w:rPr>
                 <w:rFonts w:cs="Times New Roman"/>
-                <w:color w:val="000000" w:themeColor="text1"/>
                 <w:sz w:val="26"/>
                 <w:szCs w:val="26"/>
               </w:rPr>
@@ -2399,7 +2335,6 @@
               <w:spacing w:line="312" w:lineRule="auto"/>
               <w:rPr>
                 <w:rFonts w:cs="Times New Roman"/>
-                <w:color w:val="000000" w:themeColor="text1"/>
                 <w:sz w:val="26"/>
                 <w:szCs w:val="26"/>
               </w:rPr>
@@ -2407,7 +2342,6 @@
             <w:r>
               <w:rPr>
                 <w:rFonts w:cs="Times New Roman"/>
-                <w:color w:val="000000" w:themeColor="text1"/>
                 <w:sz w:val="26"/>
                 <w:szCs w:val="26"/>
               </w:rPr>
@@ -2424,7 +2358,6 @@
               <w:spacing w:line="312" w:lineRule="auto"/>
               <w:rPr>
                 <w:rFonts w:cs="Times New Roman"/>
-                <w:color w:val="000000" w:themeColor="text1"/>
                 <w:sz w:val="26"/>
                 <w:szCs w:val="26"/>
               </w:rPr>
@@ -2432,7 +2365,6 @@
             <w:r>
               <w:rPr>
                 <w:rFonts w:cs="Times New Roman"/>
-                <w:color w:val="000000" w:themeColor="text1"/>
                 <w:sz w:val="26"/>
                 <w:szCs w:val="26"/>
               </w:rPr>
@@ -2449,7 +2381,6 @@
               <w:spacing w:line="312" w:lineRule="auto"/>
               <w:rPr>
                 <w:rFonts w:cs="Times New Roman"/>
-                <w:color w:val="000000" w:themeColor="text1"/>
                 <w:sz w:val="26"/>
                 <w:szCs w:val="26"/>
               </w:rPr>
@@ -2457,7 +2388,6 @@
             <w:r>
               <w:rPr>
                 <w:rFonts w:cs="Times New Roman"/>
-                <w:color w:val="000000" w:themeColor="text1"/>
                 <w:sz w:val="26"/>
                 <w:szCs w:val="26"/>
               </w:rPr>
@@ -2476,7 +2406,6 @@
               <w:spacing w:line="312" w:lineRule="auto"/>
               <w:rPr>
                 <w:rFonts w:cs="Times New Roman"/>
-                <w:color w:val="000000" w:themeColor="text1"/>
                 <w:sz w:val="26"/>
                 <w:szCs w:val="26"/>
               </w:rPr>
@@ -2484,7 +2413,6 @@
             <w:r>
               <w:rPr>
                 <w:rFonts w:cs="Times New Roman"/>
-                <w:color w:val="000000" w:themeColor="text1"/>
                 <w:sz w:val="26"/>
                 <w:szCs w:val="26"/>
               </w:rPr>
@@ -2501,7 +2429,6 @@
               <w:spacing w:line="312" w:lineRule="auto"/>
               <w:rPr>
                 <w:rFonts w:cs="Times New Roman"/>
-                <w:color w:val="000000" w:themeColor="text1"/>
                 <w:sz w:val="26"/>
                 <w:szCs w:val="26"/>
               </w:rPr>
@@ -2509,7 +2436,6 @@
             <w:r>
               <w:rPr>
                 <w:rFonts w:cs="Times New Roman"/>
-                <w:color w:val="000000" w:themeColor="text1"/>
                 <w:sz w:val="26"/>
                 <w:szCs w:val="26"/>
               </w:rPr>
@@ -2526,7 +2452,6 @@
               <w:spacing w:line="312" w:lineRule="auto"/>
               <w:rPr>
                 <w:rFonts w:cs="Times New Roman"/>
-                <w:color w:val="000000" w:themeColor="text1"/>
                 <w:sz w:val="26"/>
                 <w:szCs w:val="26"/>
               </w:rPr>
@@ -2534,7 +2459,6 @@
             <w:r>
               <w:rPr>
                 <w:rFonts w:cs="Times New Roman"/>
-                <w:color w:val="000000" w:themeColor="text1"/>
                 <w:sz w:val="26"/>
                 <w:szCs w:val="26"/>
               </w:rPr>
@@ -2551,7 +2475,6 @@
               <w:spacing w:line="312" w:lineRule="auto"/>
               <w:rPr>
                 <w:rFonts w:cs="Times New Roman"/>
-                <w:color w:val="000000" w:themeColor="text1"/>
                 <w:sz w:val="26"/>
                 <w:szCs w:val="26"/>
               </w:rPr>
@@ -2559,7 +2482,6 @@
             <w:r>
               <w:rPr>
                 <w:rFonts w:cs="Times New Roman"/>
-                <w:color w:val="000000" w:themeColor="text1"/>
                 <w:sz w:val="26"/>
                 <w:szCs w:val="26"/>
               </w:rPr>
@@ -2578,7 +2500,6 @@
               <w:spacing w:line="312" w:lineRule="auto"/>
               <w:rPr>
                 <w:rFonts w:cs="Times New Roman"/>
-                <w:color w:val="000000" w:themeColor="text1"/>
                 <w:sz w:val="26"/>
                 <w:szCs w:val="26"/>
               </w:rPr>
@@ -2586,7 +2507,6 @@
             <w:r>
               <w:rPr>
                 <w:rFonts w:cs="Times New Roman"/>
-                <w:color w:val="000000" w:themeColor="text1"/>
                 <w:sz w:val="26"/>
                 <w:szCs w:val="26"/>
               </w:rPr>
@@ -2603,7 +2523,6 @@
               <w:spacing w:line="312" w:lineRule="auto"/>
               <w:rPr>
                 <w:rFonts w:cs="Times New Roman"/>
-                <w:color w:val="000000" w:themeColor="text1"/>
                 <w:sz w:val="26"/>
                 <w:szCs w:val="26"/>
               </w:rPr>
@@ -2611,7 +2530,6 @@
             <w:r>
               <w:rPr>
                 <w:rFonts w:cs="Times New Roman"/>
-                <w:color w:val="000000" w:themeColor="text1"/>
                 <w:sz w:val="26"/>
                 <w:szCs w:val="26"/>
               </w:rPr>
@@ -2628,7 +2546,6 @@
               <w:spacing w:line="312" w:lineRule="auto"/>
               <w:rPr>
                 <w:rFonts w:cs="Times New Roman"/>
-                <w:color w:val="000000" w:themeColor="text1"/>
                 <w:sz w:val="26"/>
                 <w:szCs w:val="26"/>
               </w:rPr>
@@ -2636,7 +2553,6 @@
             <w:r>
               <w:rPr>
                 <w:rFonts w:cs="Times New Roman"/>
-                <w:color w:val="000000" w:themeColor="text1"/>
                 <w:sz w:val="26"/>
                 <w:szCs w:val="26"/>
               </w:rPr>
@@ -2653,7 +2569,6 @@
               <w:spacing w:line="312" w:lineRule="auto"/>
               <w:rPr>
                 <w:rFonts w:cs="Times New Roman"/>
-                <w:color w:val="000000" w:themeColor="text1"/>
                 <w:sz w:val="26"/>
                 <w:szCs w:val="26"/>
               </w:rPr>
@@ -2661,7 +2576,6 @@
             <w:r>
               <w:rPr>
                 <w:rFonts w:cs="Times New Roman"/>
-                <w:color w:val="000000" w:themeColor="text1"/>
                 <w:sz w:val="26"/>
                 <w:szCs w:val="26"/>
               </w:rPr>
@@ -2680,7 +2594,6 @@
               <w:spacing w:line="312" w:lineRule="auto"/>
               <w:rPr>
                 <w:rFonts w:cs="Times New Roman"/>
-                <w:color w:val="000000" w:themeColor="text1"/>
                 <w:sz w:val="26"/>
                 <w:szCs w:val="26"/>
               </w:rPr>
@@ -2688,7 +2601,6 @@
             <w:r>
               <w:rPr>
                 <w:rFonts w:cs="Times New Roman"/>
-                <w:color w:val="000000" w:themeColor="text1"/>
                 <w:sz w:val="26"/>
                 <w:szCs w:val="26"/>
               </w:rPr>
@@ -2705,7 +2617,6 @@
               <w:spacing w:line="312" w:lineRule="auto"/>
               <w:rPr>
                 <w:rFonts w:cs="Times New Roman"/>
-                <w:color w:val="000000" w:themeColor="text1"/>
                 <w:sz w:val="26"/>
                 <w:szCs w:val="26"/>
               </w:rPr>
@@ -2713,7 +2624,6 @@
             <w:r>
               <w:rPr>
                 <w:rFonts w:cs="Times New Roman"/>
-                <w:color w:val="000000" w:themeColor="text1"/>
                 <w:sz w:val="26"/>
                 <w:szCs w:val="26"/>
               </w:rPr>
@@ -2730,7 +2640,6 @@
               <w:spacing w:line="312" w:lineRule="auto"/>
               <w:rPr>
                 <w:rFonts w:cs="Times New Roman"/>
-                <w:color w:val="000000" w:themeColor="text1"/>
                 <w:sz w:val="26"/>
                 <w:szCs w:val="26"/>
               </w:rPr>
@@ -2738,7 +2647,6 @@
             <w:r>
               <w:rPr>
                 <w:rFonts w:cs="Times New Roman"/>
-                <w:color w:val="000000" w:themeColor="text1"/>
                 <w:sz w:val="26"/>
                 <w:szCs w:val="26"/>
               </w:rPr>
@@ -2755,7 +2663,6 @@
               <w:spacing w:line="312" w:lineRule="auto"/>
               <w:rPr>
                 <w:rFonts w:cs="Times New Roman"/>
-                <w:color w:val="000000" w:themeColor="text1"/>
                 <w:sz w:val="26"/>
                 <w:szCs w:val="26"/>
               </w:rPr>
@@ -2763,7 +2670,6 @@
             <w:r>
               <w:rPr>
                 <w:rFonts w:cs="Times New Roman"/>
-                <w:color w:val="000000" w:themeColor="text1"/>
                 <w:sz w:val="26"/>
                 <w:szCs w:val="26"/>
               </w:rPr>
@@ -2778,7 +2684,6 @@
         <w:spacing w:line="312" w:lineRule="auto"/>
         <w:rPr>
           <w:rFonts w:cs="Times New Roman"/>
-          <w:color w:val="000000" w:themeColor="text1"/>
           <w:sz w:val="26"/>
           <w:szCs w:val="26"/>
         </w:rPr>
@@ -2786,7 +2691,6 @@
       <w:r>
         <w:rPr>
           <w:rFonts w:cs="Times New Roman"/>
-          <w:color w:val="000000" w:themeColor="text1"/>
           <w:sz w:val="26"/>
           <w:szCs w:val="26"/>
         </w:rPr>
@@ -2799,7 +2703,7 @@
         <w:spacing w:line="312" w:lineRule="auto"/>
         <w:rPr>
           <w:rFonts w:ascii="Times New Roman" w:hAnsi="Times New Roman" w:cs="Times New Roman"/>
-          <w:color w:val="000000" w:themeColor="text1"/>
+          <w:color w:val="auto"/>
           <w:sz w:val="26"/>
           <w:szCs w:val="26"/>
         </w:rPr>
@@ -2807,7 +2711,7 @@
       <w:r>
         <w:rPr>
           <w:rFonts w:ascii="Times New Roman" w:hAnsi="Times New Roman" w:cs="Times New Roman"/>
-          <w:color w:val="000000" w:themeColor="text1"/>
+          <w:color w:val="auto"/>
           <w:sz w:val="26"/>
           <w:szCs w:val="26"/>
         </w:rPr>
@@ -2819,7 +2723,6 @@
         <w:spacing w:line="312" w:lineRule="auto"/>
         <w:rPr>
           <w:rFonts w:cs="Times New Roman"/>
-          <w:color w:val="000000" w:themeColor="text1"/>
           <w:sz w:val="26"/>
           <w:szCs w:val="26"/>
         </w:rPr>
@@ -2827,7 +2730,43 @@
       <w:r>
         <w:rPr>
           <w:rFonts w:cs="Times New Roman"/>
-          <w:color w:val="000000" w:themeColor="text1"/>
+          <w:sz w:val="26"/>
+          <w:szCs w:val="26"/>
+        </w:rPr>
+        <w:t>Để cải thiện MLP trong các nghiên cứu tiếp theo, có thể thử giảm số chiều đầu vào, dùng target/ordinal encoding phù hợp cho một số biến có thứ tự, tìm learning rate bằng validation, thay đổi số neuron và batch size, tăng số lần chạy với seed khác nhau, hoặc ensemble dự đoán của MLP với mô hình cây. Tuy nhiên, mọi cải thiện cần được xác nhận trên validation hoặc bằng RMSLE trên Kaggle, không chỉ dựa trên sai số train.</w:t>
+      </w:r>
+    </w:p>
+    <w:p>
+      <w:pPr>
+        <w:spacing w:line="312" w:lineRule="auto"/>
+        <w:rPr>
+          <w:rFonts w:cs="Times New Roman"/>
+          <w:sz w:val="26"/>
+          <w:szCs w:val="26"/>
+        </w:rPr>
+      </w:pPr>
+      <w:r>
+        <w:rPr>
+          <w:rFonts w:cs="Times New Roman"/>
+          <w:sz w:val="26"/>
+          <w:szCs w:val="26"/>
+        </w:rPr>
+        <w:lastRenderedPageBreak/>
+        <w:t>Phân tích lựa chọn mô hình: do validation cho thấy Random Forest có RMSE thấp hơn nhiều, nhóm ưu tiên file submission của Random Forest khi cần chọn một kết quả chính. MLP vẫn được xuất riêng để đáp ứng yêu cầu so sánh hai phương pháp và thể hiện đầy đủ thực nghiệm.</w:t>
+      </w:r>
+    </w:p>
+    <w:p>
+      <w:pPr>
+        <w:spacing w:line="312" w:lineRule="auto"/>
+        <w:rPr>
+          <w:rFonts w:cs="Times New Roman"/>
+          <w:sz w:val="26"/>
+          <w:szCs w:val="26"/>
+        </w:rPr>
+      </w:pPr>
+      <w:r>
+        <w:rPr>
+          <w:rFonts w:cs="Times New Roman"/>
           <w:sz w:val="26"/>
           <w:szCs w:val="26"/>
         </w:rPr>
@@ -2840,7 +2779,6 @@
         <w:spacing w:line="312" w:lineRule="auto"/>
         <w:rPr>
           <w:rFonts w:cs="Times New Roman"/>
-          <w:color w:val="000000" w:themeColor="text1"/>
           <w:sz w:val="26"/>
           <w:szCs w:val="26"/>
         </w:rPr>
@@ -2848,7 +2786,6 @@
       <w:r>
         <w:rPr>
           <w:rFonts w:cs="Times New Roman"/>
-          <w:color w:val="000000" w:themeColor="text1"/>
           <w:sz w:val="26"/>
           <w:szCs w:val="26"/>
         </w:rPr>
@@ -2861,7 +2798,6 @@
         <w:spacing w:line="312" w:lineRule="auto"/>
         <w:rPr>
           <w:rFonts w:cs="Times New Roman"/>
-          <w:color w:val="000000" w:themeColor="text1"/>
           <w:sz w:val="26"/>
           <w:szCs w:val="26"/>
         </w:rPr>
@@ -2869,7 +2805,6 @@
       <w:r>
         <w:rPr>
           <w:rFonts w:cs="Times New Roman"/>
-          <w:color w:val="000000" w:themeColor="text1"/>
           <w:sz w:val="26"/>
           <w:szCs w:val="26"/>
         </w:rPr>
@@ -2881,7 +2816,6 @@
         <w:spacing w:line="312" w:lineRule="auto"/>
         <w:rPr>
           <w:rFonts w:cs="Times New Roman"/>
-          <w:color w:val="000000" w:themeColor="text1"/>
           <w:sz w:val="26"/>
           <w:szCs w:val="26"/>
         </w:rPr>
@@ -2889,7 +2823,6 @@
       <w:r>
         <w:rPr>
           <w:rFonts w:cs="Times New Roman"/>
-          <w:color w:val="000000" w:themeColor="text1"/>
           <w:sz w:val="26"/>
           <w:szCs w:val="26"/>
         </w:rPr>
@@ -2902,7 +2835,7 @@
         <w:spacing w:line="312" w:lineRule="auto"/>
         <w:rPr>
           <w:rFonts w:ascii="Times New Roman" w:hAnsi="Times New Roman" w:cs="Times New Roman"/>
-          <w:color w:val="000000" w:themeColor="text1"/>
+          <w:color w:val="auto"/>
           <w:sz w:val="26"/>
           <w:szCs w:val="26"/>
         </w:rPr>
@@ -2910,21 +2843,11 @@
       <w:r>
         <w:rPr>
           <w:rFonts w:ascii="Times New Roman" w:hAnsi="Times New Roman" w:cs="Times New Roman"/>
-          <w:color w:val="000000" w:themeColor="text1"/>
+          <w:color w:val="auto"/>
           <w:sz w:val="26"/>
           <w:szCs w:val="26"/>
         </w:rPr>
-        <w:lastRenderedPageBreak/>
-        <w:t>9</w:t>
-      </w:r>
-      <w:r>
-        <w:rPr>
-          <w:rFonts w:ascii="Times New Roman" w:hAnsi="Times New Roman" w:cs="Times New Roman"/>
-          <w:color w:val="000000" w:themeColor="text1"/>
-          <w:sz w:val="26"/>
-          <w:szCs w:val="26"/>
-        </w:rPr>
-        <w:t>. Kết luận và hướng phát triển</w:t>
+        <w:t>9. Kết luận và hướng phát triển</w:t>
       </w:r>
     </w:p>
     <w:p>
@@ -2932,7 +2855,6 @@
         <w:spacing w:line="312" w:lineRule="auto"/>
         <w:rPr>
           <w:rFonts w:cs="Times New Roman"/>
-          <w:color w:val="000000" w:themeColor="text1"/>
           <w:sz w:val="26"/>
           <w:szCs w:val="26"/>
         </w:rPr>
@@ -2940,7 +2862,6 @@
       <w:r>
         <w:rPr>
           <w:rFonts w:cs="Times New Roman"/>
-          <w:color w:val="000000" w:themeColor="text1"/>
           <w:sz w:val="26"/>
           <w:szCs w:val="26"/>
         </w:rPr>
@@ -2952,7 +2873,6 @@
         <w:spacing w:line="312" w:lineRule="auto"/>
         <w:rPr>
           <w:rFonts w:cs="Times New Roman"/>
-          <w:color w:val="000000" w:themeColor="text1"/>
           <w:sz w:val="26"/>
           <w:szCs w:val="26"/>
         </w:rPr>
@@ -2960,7 +2880,6 @@
       <w:r>
         <w:rPr>
           <w:rFonts w:cs="Times New Roman"/>
-          <w:color w:val="000000" w:themeColor="text1"/>
           <w:sz w:val="26"/>
           <w:szCs w:val="26"/>
         </w:rPr>
@@ -2973,7 +2892,6 @@
         <w:spacing w:line="312" w:lineRule="auto"/>
         <w:rPr>
           <w:rFonts w:cs="Times New Roman"/>
-          <w:color w:val="000000" w:themeColor="text1"/>
           <w:sz w:val="26"/>
           <w:szCs w:val="26"/>
         </w:rPr>
@@ -2981,7 +2899,6 @@
       <w:r>
         <w:rPr>
           <w:rFonts w:cs="Times New Roman"/>
-          <w:color w:val="000000" w:themeColor="text1"/>
           <w:sz w:val="26"/>
           <w:szCs w:val="26"/>
         </w:rPr>
@@ -2994,7 +2911,6 @@
         <w:spacing w:line="312" w:lineRule="auto"/>
         <w:rPr>
           <w:rFonts w:cs="Times New Roman"/>
-          <w:color w:val="000000" w:themeColor="text1"/>
           <w:sz w:val="26"/>
           <w:szCs w:val="26"/>
         </w:rPr>
@@ -3002,7 +2918,6 @@
       <w:r>
         <w:rPr>
           <w:rFonts w:cs="Times New Roman"/>
-          <w:color w:val="000000" w:themeColor="text1"/>
           <w:sz w:val="26"/>
           <w:szCs w:val="26"/>
         </w:rPr>
@@ -3015,7 +2930,6 @@
         <w:spacing w:line="312" w:lineRule="auto"/>
         <w:rPr>
           <w:rFonts w:cs="Times New Roman"/>
-          <w:color w:val="000000" w:themeColor="text1"/>
           <w:sz w:val="26"/>
           <w:szCs w:val="26"/>
         </w:rPr>
@@ -3023,7 +2937,6 @@
       <w:r>
         <w:rPr>
           <w:rFonts w:cs="Times New Roman"/>
-          <w:color w:val="000000" w:themeColor="text1"/>
           <w:sz w:val="26"/>
           <w:szCs w:val="26"/>
         </w:rPr>

</xml_diff>